<commit_message>
R05 (em andamento): correções da revisão dos textos (Quadro 2, reprodução do artigo, alertas na B.12 e na Tabela A8, limitações 1 e 6, E2, Eq. 28, citações com ano entre colchetes) e relatório
Co-Authored-By: Claude Opus 5.5 <noreply@anthropic.com>
Claude-Session: https://claude.ai/code/session_01CWPuQS1EQNnCbSqHfPPCuA
</commit_message>
<xml_diff>
--- a/artigo/texto/apendice_B_nota_tecnica.docx
+++ b/artigo/texto/apendice_B_nota_tecnica.docx
@@ -3715,7 +3715,7 @@
         <w:t xml:space="preserve"> </w:t>
       </w:r>
       <w:r>
-        <w:t xml:space="preserve">foi substituído pelo preço médio ponderado pelo volume de quatro distribuidoras (Sulgás, Comgás, CEG e Gasmig), com a receita líquida de venda de gás não térmica e o volume correspondente das demonstrações financeiras de 2019 (Sulgás, 2020; Comgás, 2020; CEG, 2020; Gasmig, 2020); o VBP resultante está na Tabela A5. Como o VBP do S38 é fixo, a diferença vai para a distribuição pela Equação (B.8).</w:t>
+        <w:t xml:space="preserve">foi substituído pelo preço médio ponderado pelo volume de quatro distribuidoras (Sulgás, Comgás, CEG e Gasmig), com a receita líquida de venda de gás não térmica e o volume correspondente das demonstrações financeiras de 2019 (Sulgás, 2020; Comgás, [2020]; CEG, [2020]; Gasmig, [2020]); o VBP resultante está na Tabela A5. Como o VBP do S38 é fixo, a diferença vai para a distribuição pela Equação (B.8).</w:t>
       </w:r>
     </w:p>
     <w:bookmarkEnd w:id="11"/>
@@ -4013,7 +4013,7 @@
         <w:pStyle w:val="FirstParagraph"/>
       </w:pPr>
       <w:r>
-        <w:t xml:space="preserve">(Equação (21) do corpo do artigo). A energia gerada é a do serviço público. No RS, veio da geração por usina do ONS em 2019, sem a autoprodução e com a usina térmica de Canoas classificada como gás natural (ONS, 2026), num total de 22.677,5 GWh. No RB, é a diferença entre a geração do Brasil por fonte no Balanço Energético Nacional (EPE, 2020, Tabela 5.4) e a do RS, num total de 501.267,5 GWh; por construção, RS + RB reproduz o total do Brasil em cada fonte. Na correspondência com o balanço, os derivados de petróleo reúnem o óleo diesel, o óleo combustível e as outras não renováveis, e a biomassa reúne a lenha, o biodiesel e as outras renováveis. A geração solar fotovoltaica e a geração a derivados de petróleo não tinham produção no RS em 2019, e a nuclear só existe no RB; esses subsetores do RS ficaram com VBP zero (Seção B.10).</w:t>
+        <w:t xml:space="preserve">(Equação (21) do corpo do artigo). A energia gerada é a do serviço público. No RS, veio da geração por usina do ONS em 2019, sem a autoprodução e com a usina térmica de Canoas classificada como gás natural (ONS, [2026]), num total de 22.677,5 GWh. No RB, é a diferença entre a geração do Brasil por fonte no Balanço Energético Nacional (EPE, 2020, Tabela 5.4) e a do RS, num total de 501.267,5 GWh; por construção, RS + RB reproduz o total do Brasil em cada fonte. Na correspondência com o balanço, os derivados de petróleo reúnem o óleo diesel, o óleo combustível e as outras não renováveis, e a biomassa reúne a lenha, o biodiesel e as outras renováveis. A geração solar fotovoltaica e a geração a derivados de petróleo não tinham produção no RS em 2019, e a nuclear só existe no RB; esses subsetores do RS ficaram com VBP zero (Seção B.10).</w:t>
       </w:r>
     </w:p>
     <w:p>
@@ -4044,7 +4044,7 @@
         <w:t xml:space="preserve"> </w:t>
       </w:r>
       <w:r>
-        <w:t xml:space="preserve">(preços P1) são os preços médios dos leilões de geração por fonte, ponderados pela energia negociada (ANEEL, 2026), corrigidos pelo IPCA para a média de 2019 (IBGE, 2026). Para a geração nuclear, adotou-se a tarifa de Angra 1 e 2 homologada para 2019 (ANEEL, 2018b). Supôs-se que os preços relativos dos leilões representam os preços relativos da produção da matriz (HIPÓTESE); como</w:t>
+        <w:t xml:space="preserve">(preços P1) são os preços médios dos leilões de geração por fonte, ponderados pela energia negociada (ANEEL, [2026]), corrigidos pelo IPCA para a média de 2019 (IBGE, 2026). Para a geração nuclear, adotou-se a tarifa de Angra 1 e 2 homologada para 2019 (ANEEL, 2018b). Supôs-se que os preços relativos dos leilões representam os preços relativos da produção da matriz (HIPÓTESE); como</w:t>
       </w:r>
       <w:r>
         <w:t xml:space="preserve"> </w:t>
@@ -5728,7 +5728,7 @@
         <w:t xml:space="preserve"> </w:t>
       </w:r>
       <w:r>
-        <w:t xml:space="preserve">é o menor valor entre os GWh da Seção B.4 e os GWh da geração por usina do ONS no SIN, sem a autoprodução e sem Itaipu (ONS, 2026); a geração dos sistemas isolados e os subsetores sem produção não pagam a tarifa de uso da transmissão (TUST). Com essa regra, a TUST por MWh é a mesma para todas as fontes de uma região:</w:t>
+        <w:t xml:space="preserve">é o menor valor entre os GWh da Seção B.4 e os GWh da geração por usina do ONS no SIN, sem a autoprodução e sem Itaipu (ONS, [2026]); a geração dos sistemas isolados e os subsetores sem produção não pagam a tarifa de uso da transmissão (TUST). Com essa regra, a TUST por MWh é a mesma para todas as fontes de uma região:</w:t>
       </w:r>
     </w:p>
     <w:p>
@@ -7946,7 +7946,7 @@
         <w:pStyle w:val="BodyText"/>
       </w:pPr>
       <w:r>
-        <w:t xml:space="preserve">As importações do S38 são de energia (energia elétrica e gás natural) e foram atribuídas como compras de energia. No RS, foram todas para a distribuição, porque o custo do gás da Sulgás já é coberto pelas compras à extração de petróleo e gás. No RB, foram repartidas pela participação de cada produto no valor FOB das importações brasileiras de 2019 (Brasil, 2026): a energia elétrica (NCM 2716.00.00) à distribuição; o gás natural (NCM 2711.11.00 e 2711.21.00) à geração a gás natural e ao gás canalizado, na proporção</w:t>
+        <w:t xml:space="preserve">As importações do S38 são de energia (energia elétrica e gás natural) e foram atribuídas como compras de energia. No RS, foram todas para a distribuição, porque o custo do gás da Sulgás já é coberto pelas compras à extração de petróleo e gás. No RB, foram repartidas pela participação de cada produto no valor FOB das importações brasileiras de 2019 (Brasil, [2026]): a energia elétrica (NCM 2716.00.00) à distribuição; o gás natural (NCM 2711.11.00 e 2711.21.00) à geração a gás natural e ao gás canalizado, na proporção</w:t>
       </w:r>
       <w:r>
         <w:t xml:space="preserve"> </w:t>
@@ -14557,7 +14557,7 @@
         <w:pStyle w:val="FirstParagraph"/>
       </w:pPr>
       <w:r>
-        <w:t xml:space="preserve">As nove especificações (principal e oito variantes) passaram nas mesmas checagens; na E3 e na E4, a preservação das emissões vale só para o total, como descrito na Seção B.9. Além disso, conferiu-se que o arquivo da matriz original não foi alterado, que os cenários do artigo rodados na matriz original reproduzem os valores publicados, com diferença máxima de 0,005 t CO₂e (Painéis B das Tabelas 1, 3 e 4 e Tabela A2), e que a geração das tabelas, repetida, dá os mesmos números.</w:t>
+        <w:t xml:space="preserve">As nove especificações (principal e oito variantes) passaram nas mesmas checagens, sem falhas; na E3 e na E4, a preservação das emissões vale só para o total, como descrito na Seção B.9. Ficaram registrados dois alertas: o multiplicador de produção acima de 2,2, nas nove especificações (na versão principal, na geração a gás natural e no gás canalizado do RS e na geração a derivados de petróleo, latente no RS e no RB); e os insumos não energéticos da geração a gás natural abaixo do limiar da Seção B.8, em todas as especificações exceto as variantes k060 e eta005. Além disso, conferiu-se que o arquivo da matriz original não foi alterado, que os cenários do artigo rodados na matriz original reproduzem os valores publicados (arredondados a uma casa decimal, são idênticos nos Painéis B das Tabelas 1, 3 e 4, exceto a linha R4a da Tabela 4, e na Tabela A2), e que a geração das tabelas, repetida, dá os mesmos números.</w:t>
       </w:r>
     </w:p>
     <w:bookmarkEnd w:id="20"/>

</xml_diff>

<commit_message>
R05: versão final (MIP v04) — correções da verificação final (E3 sem total preservado, três tipos de alerta, linha da Tabela 4 com o vetor da Tabela A1, tolerância da Tabela A8, figuras em 7 × 4,4 pol) e relatório completo
Co-Authored-By: Claude Opus 5.5 <noreply@anthropic.com>
Claude-Session: https://claude.ai/code/session_01CWPuQS1EQNnCbSqHfPPCuA
</commit_message>
<xml_diff>
--- a/artigo/texto/apendice_B_nota_tecnica.docx
+++ b/artigo/texto/apendice_B_nota_tecnica.docx
@@ -2014,7 +2014,7 @@
         <w:pStyle w:val="FirstParagraph"/>
       </w:pPr>
       <w:r>
-        <w:t xml:space="preserve">As Equações (B.1) a (B.4) valem em todas as versões; a (B.5) vale nas versões de emissões E1 (principal) e E2. Nas variantes E3 e E4 (Seção B.9), as emissões preservam apenas o total da economia. As mesmas restrições valem para as demais contas-satélite (ocupações, água e energia). Lenzen (2011) mostra que, em análises ambientais, desagregar a tabela econômica é preferível a agregar a conta ambiental; por isso, desagregaram-se as linhas, as colunas e os insumos primários, e não só as intensidades de emissão.</w:t>
+        <w:t xml:space="preserve">As Equações (B.1) a (B.4) valem em todas as versões; a (B.5) vale nas versões de emissões E1 (principal) e E2. Na variante E3, as emissões do S38 deixam de reproduzir a base (diferem pelo resíduo); na E4, só o total da economia é preservado (Seção B.9). As mesmas restrições valem para as demais contas-satélite (ocupações, água e energia). Lenzen (2011) mostra que, em análises ambientais, desagregar a tabela econômica é preferível a agregar a conta ambiental; por isso, desagregaram-se as linhas, as colunas e os insumos primários, e não só as intensidades de emissão.</w:t>
       </w:r>
     </w:p>
     <w:bookmarkEnd w:id="9"/>
@@ -12916,7 +12916,7 @@
         <w:pStyle w:val="FirstParagraph"/>
       </w:pPr>
       <w:r>
-        <w:t xml:space="preserve">Os valores por componente estão na Tabela A7. O total movido é de 1.900.182,0 t CO₂e no RS e de 42.743.466,0 t CO₂e no RB; ficam na distribuição e no gás canalizado 75.675,7 t CO₂e no RS e 6.946.267,9 t CO₂e no RB. Só o vetor de emissões muda; a matriz monetária é a da versão final. O total de emissões da economia não muda, mas o S38 de cada região deixa de reproduzir a base: a Equação (B.5) vale só para o total. Com a mesma realocação aplicada à matriz original (retirando os valores do S38 de cada região e somando-os aos mesmos setores), obteve-se a versão A0_E4, usada para medir quanto dos resultados do artigo na matriz original depende dessas emissões (Tabela A6, Painel B).</w:t>
+        <w:t xml:space="preserve">Os valores por componente estão na Tabela A7. O total movido é de 1.900.182,0 t CO₂e no RS e de 42.743.466,0 t CO₂e no RB; da parte de resíduo, ficam na distribuição e no gás canalizado 75.675,7 t CO₂e no RS e 6.946.267,9 t CO₂e no RB, além do SF₆ da distribuição. Só o vetor de emissões muda; a matriz monetária é a da versão final. O total de emissões da economia não muda, mas o S38 de cada região deixa de reproduzir a base: a Equação (B.5) vale só para o total. Com a mesma realocação aplicada à matriz original (retirando os valores do S38 de cada região e somando-os aos mesmos setores), obteve-se a versão A0_E4, usada para medir quanto dos resultados do artigo na matriz original depende dessas emissões (Tabela A6, Painel B).</w:t>
       </w:r>
     </w:p>
     <w:bookmarkEnd w:id="17"/>
@@ -14557,7 +14557,7 @@
         <w:pStyle w:val="FirstParagraph"/>
       </w:pPr>
       <w:r>
-        <w:t xml:space="preserve">As nove especificações (principal e oito variantes) passaram nas mesmas checagens, sem falhas; na E3 e na E4, a preservação das emissões vale só para o total, como descrito na Seção B.9. Ficaram registrados dois alertas: o multiplicador de produção acima de 2,2, nas nove especificações (na versão principal, na geração a gás natural e no gás canalizado do RS e na geração a derivados de petróleo, latente no RS e no RB); e os insumos não energéticos da geração a gás natural abaixo do limiar da Seção B.8, em todas as especificações exceto as variantes k060 e eta005. Além disso, conferiu-se que o arquivo da matriz original não foi alterado, que os cenários do artigo rodados na matriz original reproduzem os valores publicados (arredondados a uma casa decimal, são idênticos nos Painéis B das Tabelas 1, 3 e 4, exceto a linha R4a da Tabela 4, e na Tabela A2), e que a geração das tabelas, repetida, dá os mesmos números.</w:t>
+        <w:t xml:space="preserve">As nove especificações (principal e oito variantes) passaram nas mesmas checagens, sem falhas; na E3, as emissões do S38 deixam de reproduzir a base, e na E4 só o total da economia é preservado (Seção B.9), o que fica registrado como alerta. Ficaram registrados também dois outros alertas: o multiplicador de produção acima de 2,2, nas nove especificações (na versão principal, na geração a gás natural e no gás canalizado do RS e na geração a derivados de petróleo do RS, latente, e do RB); e os insumos não energéticos da geração a gás natural abaixo do limiar da Seção B.8, em todas as especificações exceto as variantes k060 e eta005. Além disso, conferiu-se que o arquivo da matriz original não foi alterado, que os cenários do artigo rodados na matriz original reproduzem os valores publicados (arredondados a uma casa decimal, são idênticos nos Painéis B das Tabelas 1, 3 e 4 e na Tabela A2, exceto a linha da cesta renovável energia/transporte-intensiva da Tabela 4 calculada com o vetor da Tabela A1), e que a geração das tabelas, repetida, dá os mesmos números.</w:t>
       </w:r>
     </w:p>
     <w:bookmarkEnd w:id="20"/>

</xml_diff>